<commit_message>
New changes since Thursday's class
</commit_message>
<xml_diff>
--- a/assignment-3/snyder-ai-log.docx
+++ b/assignment-3/snyder-ai-log.docx
@@ -66,7 +66,33 @@
           <w:szCs w:val="26"/>
           <w14:ligatures w14:val="none"/>
         </w:rPr>
-        <w:t>____</w:t>
+        <w:t>Bootstrap Nav, Hero, &amp; Accessib</w:t>
+      </w:r>
+      <w:r>
+        <w:rPr>
+          <w:rFonts w:eastAsia="Times New Roman" w:cs="Arial"/>
+          <w:b/>
+          <w:bCs/>
+          <w:color w:val="000000"/>
+          <w:kern w:val="0"/>
+          <w:sz w:val="26"/>
+          <w:szCs w:val="26"/>
+          <w14:ligatures w14:val="none"/>
+        </w:rPr>
+        <w:t>i</w:t>
+      </w:r>
+      <w:r>
+        <w:rPr>
+          <w:rFonts w:eastAsia="Times New Roman" w:cs="Arial"/>
+          <w:b/>
+          <w:bCs/>
+          <w:color w:val="000000"/>
+          <w:kern w:val="0"/>
+          <w:sz w:val="26"/>
+          <w:szCs w:val="26"/>
+          <w14:ligatures w14:val="none"/>
+        </w:rPr>
+        <w:t>lity</w:t>
       </w:r>
     </w:p>
     <w:p>
@@ -139,269 +165,149 @@
       </w:pPr>
     </w:p>
     <w:p>
-      <w:r>
-        <w:t>Reviewed my HTML and CSS against the handouts and my professor’s feedback.</w:t>
+      <w:pPr>
+        <w:ind w:firstLine="720"/>
+      </w:pPr>
+      <w:r>
+        <w:t>Claude helped me make several changes to my navigation bar and search field. I</w:t>
+      </w:r>
+      <w:r>
+        <w:t xml:space="preserve">t </w:t>
+      </w:r>
+      <w:r>
+        <w:t xml:space="preserve">helped me </w:t>
+      </w:r>
+      <w:r>
+        <w:t xml:space="preserve">customize the colors of the navigation links in their default, active, and hover states. Claude also helped me make the navigation links bold </w:t>
+      </w:r>
+      <w:r>
+        <w:t>on</w:t>
+      </w:r>
+      <w:r>
+        <w:t xml:space="preserve"> </w:t>
+      </w:r>
+      <w:r>
+        <w:t>h</w:t>
+      </w:r>
+      <w:r>
+        <w:t>over without shifting the positions of the other links. I used Claude to change the Search button's outline and hover colors, remove Bootstrap's default blue focus glow from the search box, and replace it with a color that matched the rest of my header. Claude also helped me change the font for the "news about</w:t>
+      </w:r>
+      <w:r>
+        <w:t>…</w:t>
+      </w:r>
+      <w:r>
+        <w:t>" text in the search field. For smaller screens, Claude helped me make the hamburger menu icon lighter and move it from the center to the right side of the navbar</w:t>
+      </w:r>
+      <w:r>
+        <w:t>, as required by the diagram</w:t>
+      </w:r>
+      <w:r>
+        <w:t>.</w:t>
+      </w:r>
+      <w:r>
+        <w:t xml:space="preserve"> </w:t>
+      </w:r>
+      <w:r>
+        <w:t xml:space="preserve">In my aside, </w:t>
+      </w:r>
+      <w:r>
+        <w:t xml:space="preserve">Claude helped me prevent long URLs from extending outside their containers next to the corresponding logos. It explained Bootstrap's grid nesting system and showed me how to structure the "You Might Also Like" section correctly. Claude also </w:t>
+      </w:r>
+      <w:r>
+        <w:t>re-</w:t>
+      </w:r>
+      <w:r>
+        <w:t xml:space="preserve">explained why using col-9 and col-3 prevented my columns from stacking on smaller screens and </w:t>
+      </w:r>
+      <w:r>
+        <w:t>reminded</w:t>
+      </w:r>
+      <w:r>
+        <w:t xml:space="preserve"> me how to use breakpoint classes such as col-md-* instead. I used Claude to make the images in my "You Might Also Like" cards the same height so that the cards aligned consistently and to center those cards on smaller screens. Claude also taught me how to use object-position to control which portion of an image remains visible when the cards change size.</w:t>
       </w:r>
     </w:p>
     <w:p>
-      <w:r>
-        <w:t xml:space="preserve">Flagged problems: the image-fluid typo, the leftover 960px image rule, inconsistent </w:t>
-      </w:r>
-      <w:proofErr w:type="spellStart"/>
-      <w:r>
-        <w:t>rel</w:t>
-      </w:r>
-      <w:proofErr w:type="spellEnd"/>
-      <w:r>
-        <w:t>="</w:t>
-      </w:r>
-      <w:proofErr w:type="spellStart"/>
-      <w:r>
-        <w:t>noopener</w:t>
-      </w:r>
-      <w:proofErr w:type="spellEnd"/>
+      <w:pPr>
+        <w:ind w:firstLine="720"/>
+      </w:pPr>
+      <w:r>
+        <w:t>For styling</w:t>
+      </w:r>
+      <w:r>
+        <w:t>,</w:t>
+      </w:r>
+      <w:r>
+        <w:t xml:space="preserve"> Claude </w:t>
+      </w:r>
+      <w:r>
+        <w:t xml:space="preserve">showed me how </w:t>
+      </w:r>
+      <w:r>
+        <w:t>to add CSS transform transitions to my buttons to make their hover effects smoother. Claude also helped me adjust some of the green colors on my page to improve contrast and readability. Claude explained how :focus-visible works and helped me understand the difference between CSS outlines and Bootstrap's default blue focus box-shadow. I used this information to customize the focus states of my "Read Article" buttons, Search button, and other interactive elements so Bootstrap's default blue and green colors did</w:t>
+      </w:r>
+      <w:r>
+        <w:t>n'</w:t>
+      </w:r>
+      <w:r>
+        <w:t>t appear when navigating with the keyboard. Claude also helped me change the keyboard focus styling of my footer links, including "Contact Us," and make the focus outlines around my social media icons white so they remained visible against the footer background.</w:t>
+      </w:r>
       <w:r>
         <w:t xml:space="preserve"> </w:t>
-      </w:r>
-      <w:proofErr w:type="spellStart"/>
-      <w:r>
-        <w:t>noreferrer</w:t>
-      </w:r>
-      <w:proofErr w:type="spellEnd"/>
-      <w:r>
-        <w:t>", and non-breakpoint column classes.</w:t>
       </w:r>
     </w:p>
     <w:p>
-      <w:r>
-        <w:t>Explained Bootstrap nesting and gave an example structure for “You May Also Like.”</w:t>
-      </w:r>
-    </w:p>
-    <w:p>
-      <w:r>
-        <w:t>Explained why col-9 / col-3 don’t stack on mobile and which col-md-* classes to use instead.</w:t>
-      </w:r>
-    </w:p>
-    <w:p>
-      <w:r>
-        <w:t>Audited the page for accessibility: contrast, alt text, hidden link labels, heading order, keyboard focus, and empty footer row wrappers.</w:t>
-      </w:r>
-    </w:p>
-    <w:p>
+      <w:pPr>
+        <w:ind w:firstLine="720"/>
+      </w:pPr>
+      <w:r>
+        <w:t>In my hero</w:t>
+      </w:r>
+      <w:r>
+        <w:t xml:space="preserve"> section</w:t>
+      </w:r>
+      <w:r>
+        <w:t xml:space="preserve">, </w:t>
+      </w:r>
+      <w:r>
+        <w:t xml:space="preserve">Claude helped me </w:t>
+      </w:r>
+      <w:r>
+        <w:rPr>
+          <w:kern w:val="0"/>
+          <w14:ligatures w14:val="none"/>
+        </w:rPr>
+        <w:t xml:space="preserve">set my desired image as the background and add a gradient </w:t>
+      </w:r>
       <w:proofErr w:type="gramStart"/>
       <w:r>
-        <w:t>Explained :focus</w:t>
+        <w:rPr>
+          <w:kern w:val="0"/>
+          <w14:ligatures w14:val="none"/>
+        </w:rPr>
+        <w:t>above</w:t>
       </w:r>
       <w:proofErr w:type="gramEnd"/>
       <w:r>
-        <w:t>-visible, outlines versus Bootstrap’s blue box-shadow, and how to pick focus colors with enough contrast.</w:t>
-      </w:r>
-    </w:p>
-    <w:p>
-      <w:r>
-        <w:t>Reviewed my updated CSS for syntax and contrast.</w:t>
-      </w:r>
-    </w:p>
-    <w:p>
-      <w:r>
-        <w:t>Outlined the structure and approach for hero.html: container, row, col-md-9, background image, and overlay.</w:t>
-      </w:r>
-    </w:p>
-    <w:p>
-      <w:r>
-        <w:t>Made one mistake (said my professor flagged a space before “Aisha Malik”) and corrected it when I shared his actual feedback.</w:t>
-      </w:r>
-    </w:p>
-    <w:p/>
-    <w:p>
-      <w:r>
-        <w:t xml:space="preserve">I don't remember past sessions on my own, so I went through the saved Claude Code transcripts in this folder. Three sessions between Oct 8 and Oct 12 worked on assignment-3/ (page-snyder.html and </w:t>
-      </w:r>
-      <w:proofErr w:type="spellStart"/>
-      <w:r>
-        <w:t>css</w:t>
-      </w:r>
-      <w:proofErr w:type="spellEnd"/>
-      <w:r>
-        <w:t xml:space="preserve">/style.css). Mostly I explained how to do </w:t>
-      </w:r>
-      <w:proofErr w:type="gramStart"/>
-      <w:r>
-        <w:t>things</w:t>
-      </w:r>
-      <w:proofErr w:type="gramEnd"/>
-      <w:r>
-        <w:t xml:space="preserve"> and you wrote the code yourself.</w:t>
-      </w:r>
-    </w:p>
-    <w:p/>
-    <w:p>
-      <w:r>
-        <w:t>Navbar and header (Oct 8–9)</w:t>
-      </w:r>
-    </w:p>
-    <w:p/>
-    <w:p>
-      <w:r>
-        <w:t>Making the navbar background transparent.</w:t>
-      </w:r>
-    </w:p>
-    <w:p>
-      <w:r>
-        <w:t xml:space="preserve">Changing the colors for unselected, selected (active) and hovered nav links. We also covered </w:t>
-      </w:r>
-      <w:proofErr w:type="gramStart"/>
-      <w:r>
-        <w:t>why ::selection</w:t>
-      </w:r>
-      <w:proofErr w:type="gramEnd"/>
-      <w:r>
-        <w:t xml:space="preserve"> doesn't do what you wanted there.</w:t>
-      </w:r>
-    </w:p>
-    <w:p>
-      <w:r>
-        <w:lastRenderedPageBreak/>
-        <w:t xml:space="preserve">Styling the dropdown </w:t>
-      </w:r>
-      <w:proofErr w:type="gramStart"/>
-      <w:r>
-        <w:t>menu, and</w:t>
-      </w:r>
-      <w:proofErr w:type="gramEnd"/>
-      <w:r>
-        <w:t xml:space="preserve"> fixing its text going black after you click it and move the cursor away.</w:t>
-      </w:r>
-    </w:p>
-    <w:p>
-      <w:r>
-        <w:t>Animating the underline on hover.</w:t>
-      </w:r>
-    </w:p>
-    <w:p>
-      <w:r>
-        <w:t>Making the hover text bold without pushing the other nav items sideways.</w:t>
-      </w:r>
-    </w:p>
-    <w:p>
-      <w:r>
-        <w:t xml:space="preserve">Changing the Search button's outline and hover </w:t>
-      </w:r>
-      <w:proofErr w:type="gramStart"/>
-      <w:r>
-        <w:t>colors, and</w:t>
-      </w:r>
-      <w:proofErr w:type="gramEnd"/>
-      <w:r>
-        <w:t xml:space="preserve"> getting rid of the blue glow when you type in the search box.</w:t>
-      </w:r>
-    </w:p>
-    <w:p>
-      <w:r>
-        <w:t>Content and cards (Oct 9)</w:t>
-      </w:r>
-    </w:p>
-    <w:p/>
-    <w:p>
-      <w:r>
-        <w:t>Making an image a link. In that session I edited your HTML and CSS directly to make a TechCrunch logo a link.</w:t>
-      </w:r>
-    </w:p>
-    <w:p>
-      <w:r>
-        <w:t>Making the card images all the same height so the cards line up.</w:t>
-      </w:r>
-    </w:p>
-    <w:p>
-      <w:r>
-        <w:t>Changing the font for "news about."</w:t>
-      </w:r>
-    </w:p>
-    <w:p>
-      <w:r>
-        <w:t>Adding a gradient overlay on images when you hover. That one never worked: the logo disappeared, and you removed the code.</w:t>
-      </w:r>
-    </w:p>
-    <w:p>
-      <w:r>
-        <w:t>Responsive fixes (Oct 12)</w:t>
-      </w:r>
-    </w:p>
-    <w:p/>
-    <w:p>
-      <w:r>
-        <w:t>Restyling the hamburger icon so it's lighter on small screens, then moving it to the right instead of the center. Here I edited style.css when you only wanted to know how. You told me so, and since then I explain instead of editing for "how do I" questions.</w:t>
-      </w:r>
-    </w:p>
-    <w:p>
-      <w:r>
-        <w:t>Centering the "You may also like" cards on small screens.</w:t>
-      </w:r>
-    </w:p>
-    <w:p>
-      <w:r>
-        <w:t>Choosing which part of an image shows in a card on small screens (object-position).</w:t>
-      </w:r>
-    </w:p>
-    <w:p>
-      <w:r>
-        <w:t>Explaining why a piece of your code was there.</w:t>
-      </w:r>
-    </w:p>
-    <w:p>
-      <w:r>
-        <w:t>Keyboard focus and accessibility (Oct 12)</w:t>
-      </w:r>
-    </w:p>
-    <w:p/>
-    <w:p>
-      <w:r>
-        <w:t>Replacing the Bootstrap defaults that show up when you tab through the page: blue "Read article" buttons, the green Search button, and blue outlines.</w:t>
-      </w:r>
-    </w:p>
-    <w:p>
-      <w:r>
-        <w:t>Fixing the double green outline on the header logo.</w:t>
-      </w:r>
-    </w:p>
-    <w:p>
-      <w:r>
-        <w:lastRenderedPageBreak/>
-        <w:t>Changing the footer links (Contact Us and the others) so they aren't blue when tabbed to, and making the social icon outlines white so you can see them.</w:t>
-      </w:r>
-    </w:p>
-    <w:p>
-      <w:r>
-        <w:t xml:space="preserve">Changing the Search box's focus glow to </w:t>
-      </w:r>
-      <w:proofErr w:type="spellStart"/>
-      <w:proofErr w:type="gramStart"/>
-      <w:r>
-        <w:t>rgba</w:t>
-      </w:r>
-      <w:proofErr w:type="spellEnd"/>
-      <w:r>
-        <w:t>(</w:t>
-      </w:r>
-      <w:proofErr w:type="gramEnd"/>
-      <w:r>
-        <w:t>90, 192, 76, 0.4) to match the other header rings.</w:t>
-      </w:r>
-    </w:p>
-    <w:p>
-      <w:r>
-        <w:t>Bringing back the outlines on the "Final Cut Pro" cards and similar ones after they went missing.</w:t>
-      </w:r>
-    </w:p>
-    <w:p>
-      <w:r>
-        <w:t>Neither edit I made directly (the TechCrunch logo link and the hamburger styling) is in your current files, so you removed or rewrote both.</w:t>
-      </w:r>
-    </w:p>
-    <w:p/>
-    <w:p>
-      <w:r>
-        <w:t>There's also an Oct 6 session about changing an SVG. It doesn't name a folder, so I can't tell whether it was for Assignment 3. Your Oct 1 sessions were for Assignment 2.</w:t>
+        <w:rPr>
+          <w:kern w:val="0"/>
+          <w14:ligatures w14:val="none"/>
+        </w:rPr>
+        <w:t xml:space="preserve"> so the</w:t>
+      </w:r>
+      <w:r>
+        <w:t xml:space="preserve"> text is visible. </w:t>
+      </w:r>
+      <w:r>
+        <w:t xml:space="preserve">Next, Claude helped me </w:t>
+      </w:r>
+      <w:r>
+        <w:t xml:space="preserve">move my text down to the bottom of the section to show more of the background image. Finally, Claude helped me </w:t>
+      </w:r>
+      <w:r>
+        <w:t>create an “Add to Reading List” style button since my desired Bootstrap hero section had two buttons</w:t>
+      </w:r>
+      <w:r>
+        <w:t xml:space="preserve"> and I wanted to use both.</w:t>
       </w:r>
     </w:p>
     <w:sectPr>
@@ -462,6 +368,10 @@
     </w:p>
   </w:footnote>
 </w:footnotes>
+</file>
+
+<file path=word/numbering.xml><?xml version="1.0" encoding="utf-8"?>
+<w:numbering xmlns:wpc="http://schemas.microsoft.com/office/word/2010/wordprocessingCanvas" xmlns:cx="http://schemas.microsoft.com/office/drawing/2014/chartex" xmlns:cx1="http://schemas.microsoft.com/office/drawing/2015/9/8/chartex" xmlns:cx2="http://schemas.microsoft.com/office/drawing/2015/10/21/chartex" xmlns:cx3="http://schemas.microsoft.com/office/drawing/2016/5/9/chartex" xmlns:cx4="http://schemas.microsoft.com/office/drawing/2016/5/10/chartex" xmlns:cx5="http://schemas.microsoft.com/office/drawing/2016/5/11/chartex" xmlns:cx6="http://schemas.microsoft.com/office/drawing/2016/5/12/chartex" xmlns:cx7="http://schemas.microsoft.com/office/drawing/2016/5/13/chartex" xmlns:cx8="http://schemas.microsoft.com/office/drawing/2016/5/14/chartex" xmlns:mc="http://schemas.openxmlformats.org/markup-compatibility/2006" xmlns:m="http://schemas.openxmlformats.org/officeDocument/2006/math" xmlns:aink="http://schemas.microsoft.com/office/drawing/2016/ink" xmlns:am3d="http://schemas.microsoft.com/office/drawing/2017/model3d" xmlns:oel="http://schemas.microsoft.com/office/2019/extlst" xmlns:r="http://schemas.openxmlformats.org/officeDocument/2006/relationships" xmlns:wp14="http://schemas.microsoft.com/office/word/2010/wordprocessingDrawing" xmlns:wp="http://schemas.openxmlformats.org/drawingml/2006/wordprocessingDrawing" xmlns:wpg="http://schemas.microsoft.com/office/word/2010/wordprocessingGroup" xmlns:wpi="http://schemas.microsoft.com/office/word/2010/wordprocessingInk" xmlns:wps="http://schemas.microsoft.com/office/word/2010/wordprocessingShape" xmlns:o="urn:schemas-microsoft-com:office:office" xmlns:v="urn:schemas-microsoft-com:vml" xmlns:w10="urn:schemas-microsoft-com:office:word" xmlns:w="http://schemas.openxmlformats.org/wordprocessingml/2006/main" xmlns:w14="http://schemas.microsoft.com/office/word/2010/wordml" xmlns:w15="http://schemas.microsoft.com/office/word/2012/wordml" xmlns:w16cex="http://schemas.microsoft.com/office/word/2018/wordml/cex" xmlns:w16cid="http://schemas.microsoft.com/office/word/2016/wordml/cid" xmlns:w16="http://schemas.microsoft.com/office/word/2018/wordml" xmlns:w16sdtdh="http://schemas.microsoft.com/office/word/2020/wordml/sdtdatahash" xmlns:w16sdtfl="http://schemas.microsoft.com/office/word/2024/wordml/sdtformatlock" xmlns:w16se="http://schemas.microsoft.com/office/word/2015/wordml/symex" xmlns:w16du="http://schemas.microsoft.com/office/word/2023/wordml/word16du" xmlns:wne="http://schemas.microsoft.com/office/word/2006/wordml" mc:Ignorable="w14 w15 w16se w16cid w16 w16cex w16sdtdh w16sdtfl w16du wp14"/>
 </file>
 
 <file path=word/styles.xml><?xml version="1.0" encoding="utf-8"?>

</xml_diff>